<commit_message>
Track commercial launch schedule
</commit_message>
<xml_diff>
--- a/docs/Akashic_Research_Engine_Commercial_Platform_Plan.docx
+++ b/docs/Akashic_Research_Engine_Commercial_Platform_Plan.docx
@@ -494,7 +494,7 @@
           </w:tcPr>
           <w:p>
             <w:pPr>
-              <w:spacing w:after="80"/>
+              <w:spacing w:after="0"/>
             </w:pPr>
             <w:r>
               <w:rPr>
@@ -4222,7 +4222,7 @@
           </w:tcPr>
           <w:p>
             <w:pPr>
-              <w:spacing w:after="80"/>
+              <w:spacing w:after="0"/>
             </w:pPr>
             <w:r>
               <w:rPr>
@@ -6280,6 +6280,9 @@
             <w:vAlign w:val="center"/>
           </w:tcPr>
           <w:p>
+            <w:pPr>
+              <w:spacing w:after="0"/>
+            </w:pPr>
             <w:r>
               <w:t>Homepage</w:t>
             </w:r>
@@ -6504,6 +6507,9 @@
             <w:vAlign w:val="center"/>
           </w:tcPr>
           <w:p>
+            <w:pPr>
+              <w:spacing w:after="0"/>
+            </w:pPr>
             <w:r>
               <w:t>Sources</w:t>
             </w:r>
@@ -6728,6 +6734,9 @@
             <w:vAlign w:val="center"/>
           </w:tcPr>
           <w:p>
+            <w:pPr>
+              <w:spacing w:after="0"/>
+            </w:pPr>
             <w:r>
               <w:t>Discovery</w:t>
             </w:r>
@@ -6952,6 +6961,9 @@
             <w:vAlign w:val="center"/>
           </w:tcPr>
           <w:p>
+            <w:pPr>
+              <w:spacing w:after="0"/>
+            </w:pPr>
             <w:r>
               <w:t>Import/review</w:t>
             </w:r>
@@ -7176,6 +7188,9 @@
             <w:vAlign w:val="center"/>
           </w:tcPr>
           <w:p>
+            <w:pPr>
+              <w:spacing w:after="0"/>
+            </w:pPr>
             <w:r>
               <w:t>Assistant</w:t>
             </w:r>
@@ -7400,6 +7415,9 @@
             <w:vAlign w:val="center"/>
           </w:tcPr>
           <w:p>
+            <w:pPr>
+              <w:spacing w:after="0"/>
+            </w:pPr>
             <w:r>
               <w:t>Builder</w:t>
             </w:r>
@@ -7624,6 +7642,9 @@
             <w:vAlign w:val="center"/>
           </w:tcPr>
           <w:p>
+            <w:pPr>
+              <w:spacing w:after="0"/>
+            </w:pPr>
             <w:r>
               <w:t>Exports</w:t>
             </w:r>
@@ -7848,6 +7869,9 @@
             <w:vAlign w:val="center"/>
           </w:tcPr>
           <w:p>
+            <w:pPr>
+              <w:spacing w:after="0"/>
+            </w:pPr>
             <w:r>
               <w:t>Admin</w:t>
             </w:r>
@@ -10703,29 +10727,13 @@
           </w:tcPr>
           <w:p>
             <w:pPr>
-              <w:spacing w:after="80"/>
+              <w:spacing w:after="0"/>
             </w:pPr>
             <w:r>
-              <w:rPr>
-                <w:rFonts w:ascii="Aptos" w:hAnsi="Aptos"/>
-                <w:b/>
-                <w:color w:val="19324A"/>
-                <w:sz w:val="22"/>
-              </w:rPr>
               <w:t>Recommended Next Build Order</w:t>
-            </w:r>
-          </w:p>
-          <w:p>
-            <w:pPr>
-              <w:spacing w:after="0" w:line="259" w:lineRule="auto"/>
-            </w:pPr>
-            <w:r>
-              <w:rPr>
-                <w:rFonts w:ascii="Aptos" w:hAnsi="Aptos"/>
-                <w:color w:val="263238"/>
-                <w:sz w:val="18"/>
-              </w:rPr>
-              <w:t>Start with Phase 0 and Phase 1 together: beta tester preservation, route split, homepage, login/register skeleton, and server-derived account context. Do not enforce paid gates until the beta account can sign in and retain full access.</w:t>
+              <w:br/>
+              <w:br/>
+              <w:t>Continue Phase 2 and Phase 3 together: durable sessions, shared API scope middleware, quota meters, and beta sign-in verification. Do not treat billing as complete until Stripe webhooks update server-owned entitlements automatically.</w:t>
             </w:r>
           </w:p>
         </w:tc>
@@ -10914,16 +10922,10 @@
           </w:tcPr>
           <w:p>
             <w:pPr>
-              <w:spacing w:after="0" w:line="252" w:lineRule="auto"/>
-              <w:jc w:val="left"/>
+              <w:spacing w:after="0"/>
             </w:pPr>
             <w:r>
-              <w:rPr>
-                <w:rFonts w:ascii="Aptos" w:hAnsi="Aptos"/>
-                <w:b w:val="0"/>
-                <w:sz w:val="16"/>
-              </w:rPr>
-              <w:t>[ ] Not started</w:t>
+              <w:t>Complete</w:t>
             </w:r>
           </w:p>
         </w:tc>
@@ -10947,15 +10949,10 @@
           </w:tcPr>
           <w:p>
             <w:pPr>
-              <w:spacing w:after="0" w:line="252" w:lineRule="auto"/>
-              <w:jc w:val="left"/>
+              <w:spacing w:after="0"/>
             </w:pPr>
             <w:r>
-              <w:rPr>
-                <w:rFonts w:ascii="Aptos" w:hAnsi="Aptos"/>
-                <w:b w:val="0"/>
-                <w:sz w:val="16"/>
-              </w:rPr>
+              <w:t>Beta entitlement, Admin/Beta scopes, and controlled fallback access are implemented.</w:t>
             </w:r>
           </w:p>
         </w:tc>
@@ -11014,16 +11011,10 @@
           </w:tcPr>
           <w:p>
             <w:pPr>
-              <w:spacing w:after="0" w:line="252" w:lineRule="auto"/>
-              <w:jc w:val="left"/>
+              <w:spacing w:after="0"/>
             </w:pPr>
             <w:r>
-              <w:rPr>
-                <w:rFonts w:ascii="Aptos" w:hAnsi="Aptos"/>
-                <w:b w:val="0"/>
-                <w:sz w:val="16"/>
-              </w:rPr>
-              <w:t>[ ] Not started</w:t>
+              <w:t>Complete</w:t>
             </w:r>
           </w:p>
         </w:tc>
@@ -11047,15 +11038,10 @@
           </w:tcPr>
           <w:p>
             <w:pPr>
-              <w:spacing w:after="0" w:line="252" w:lineRule="auto"/>
-              <w:jc w:val="left"/>
+              <w:spacing w:after="0"/>
             </w:pPr>
             <w:r>
-              <w:rPr>
-                <w:rFonts w:ascii="Aptos" w:hAnsi="Aptos"/>
-                <w:b w:val="0"/>
-                <w:sz w:val="16"/>
-              </w:rPr>
+              <w:t>Homepage, pricing, login/register, and /app workspace split are implemented.</w:t>
             </w:r>
           </w:p>
         </w:tc>
@@ -11114,16 +11100,10 @@
           </w:tcPr>
           <w:p>
             <w:pPr>
-              <w:spacing w:after="0" w:line="252" w:lineRule="auto"/>
-              <w:jc w:val="left"/>
+              <w:spacing w:after="0"/>
             </w:pPr>
             <w:r>
-              <w:rPr>
-                <w:rFonts w:ascii="Aptos" w:hAnsi="Aptos"/>
-                <w:b w:val="0"/>
-                <w:sz w:val="16"/>
-              </w:rPr>
-              <w:t>[ ] Not started</w:t>
+              <w:t>In progress</w:t>
             </w:r>
           </w:p>
         </w:tc>
@@ -11147,15 +11127,10 @@
           </w:tcPr>
           <w:p>
             <w:pPr>
-              <w:spacing w:after="0" w:line="252" w:lineRule="auto"/>
-              <w:jc w:val="left"/>
+              <w:spacing w:after="0"/>
             </w:pPr>
             <w:r>
-              <w:rPr>
-                <w:rFonts w:ascii="Aptos" w:hAnsi="Aptos"/>
-                <w:b w:val="0"/>
-                <w:sz w:val="16"/>
-              </w:rPr>
+              <w:t>Add durable sessions, expiry handling, logout, and account recovery.</w:t>
             </w:r>
           </w:p>
         </w:tc>
@@ -11214,16 +11189,10 @@
           </w:tcPr>
           <w:p>
             <w:pPr>
-              <w:spacing w:after="0" w:line="252" w:lineRule="auto"/>
-              <w:jc w:val="left"/>
+              <w:spacing w:after="0"/>
             </w:pPr>
             <w:r>
-              <w:rPr>
-                <w:rFonts w:ascii="Aptos" w:hAnsi="Aptos"/>
-                <w:b w:val="0"/>
-                <w:sz w:val="16"/>
-              </w:rPr>
-              <w:t>[ ] Not started</w:t>
+              <w:t>In progress</w:t>
             </w:r>
           </w:p>
         </w:tc>
@@ -11247,15 +11216,10 @@
           </w:tcPr>
           <w:p>
             <w:pPr>
-              <w:spacing w:after="0" w:line="252" w:lineRule="auto"/>
-              <w:jc w:val="left"/>
+              <w:spacing w:after="0"/>
             </w:pPr>
             <w:r>
-              <w:rPr>
-                <w:rFonts w:ascii="Aptos" w:hAnsi="Aptos"/>
-                <w:b w:val="0"/>
-                <w:sz w:val="16"/>
-              </w:rPr>
+              <w:t>Apply shared server-side scope middleware and add quota meters.</w:t>
             </w:r>
           </w:p>
         </w:tc>
@@ -11314,16 +11278,10 @@
           </w:tcPr>
           <w:p>
             <w:pPr>
-              <w:spacing w:after="0" w:line="252" w:lineRule="auto"/>
-              <w:jc w:val="left"/>
+              <w:spacing w:after="0"/>
             </w:pPr>
             <w:r>
-              <w:rPr>
-                <w:rFonts w:ascii="Aptos" w:hAnsi="Aptos"/>
-                <w:b w:val="0"/>
-                <w:sz w:val="16"/>
-              </w:rPr>
-              <w:t>[ ] Not started</w:t>
+              <w:t>Scheduled</w:t>
             </w:r>
           </w:p>
         </w:tc>
@@ -11347,15 +11305,10 @@
           </w:tcPr>
           <w:p>
             <w:pPr>
-              <w:spacing w:after="0" w:line="252" w:lineRule="auto"/>
-              <w:jc w:val="left"/>
+              <w:spacing w:after="0"/>
             </w:pPr>
             <w:r>
-              <w:rPr>
-                <w:rFonts w:ascii="Aptos" w:hAnsi="Aptos"/>
-                <w:b w:val="0"/>
-                <w:sz w:val="16"/>
-              </w:rPr>
+              <w:t>Sync Stripe webhooks, customer portal, and subscription status changes.</w:t>
             </w:r>
           </w:p>
         </w:tc>
@@ -11414,16 +11367,10 @@
           </w:tcPr>
           <w:p>
             <w:pPr>
-              <w:spacing w:after="0" w:line="252" w:lineRule="auto"/>
-              <w:jc w:val="left"/>
+              <w:spacing w:after="0"/>
             </w:pPr>
             <w:r>
-              <w:rPr>
-                <w:rFonts w:ascii="Aptos" w:hAnsi="Aptos"/>
-                <w:b w:val="0"/>
-                <w:sz w:val="16"/>
-              </w:rPr>
-              <w:t>[ ] Not started</w:t>
+              <w:t>Scheduled</w:t>
             </w:r>
           </w:p>
         </w:tc>
@@ -11447,15 +11394,10 @@
           </w:tcPr>
           <w:p>
             <w:pPr>
-              <w:spacing w:after="0" w:line="252" w:lineRule="auto"/>
-              <w:jc w:val="left"/>
+              <w:spacing w:after="0"/>
             </w:pPr>
             <w:r>
-              <w:rPr>
-                <w:rFonts w:ascii="Aptos" w:hAnsi="Aptos"/>
-                <w:b w:val="0"/>
-                <w:sz w:val="16"/>
-              </w:rPr>
+              <w:t>Add organizations, members, manual licenses, and enterprise admin tools.</w:t>
             </w:r>
           </w:p>
         </w:tc>
@@ -11514,16 +11456,10 @@
           </w:tcPr>
           <w:p>
             <w:pPr>
-              <w:spacing w:after="0" w:line="252" w:lineRule="auto"/>
-              <w:jc w:val="left"/>
+              <w:spacing w:after="0"/>
             </w:pPr>
             <w:r>
-              <w:rPr>
-                <w:rFonts w:ascii="Aptos" w:hAnsi="Aptos"/>
-                <w:b w:val="0"/>
-                <w:sz w:val="16"/>
-              </w:rPr>
-              <w:t>[ ] Not started</w:t>
+              <w:t>Scheduled</w:t>
             </w:r>
           </w:p>
         </w:tc>
@@ -11547,21 +11483,962 @@
           </w:tcPr>
           <w:p>
             <w:pPr>
-              <w:spacing w:after="0" w:line="252" w:lineRule="auto"/>
-              <w:jc w:val="left"/>
+              <w:spacing w:after="0"/>
             </w:pPr>
             <w:r>
-              <w:rPr>
-                <w:rFonts w:ascii="Aptos" w:hAnsi="Aptos"/>
-                <w:b w:val="0"/>
-                <w:sz w:val="16"/>
-              </w:rPr>
+              <w:t>Complete tests, audit logs, backup checks, rollback, and launch checklist.</w:t>
             </w:r>
           </w:p>
         </w:tc>
       </w:tr>
     </w:tbl>
     <w:p/>
+    <w:p>
+      <w:r>
+        <w:br w:type="page"/>
+      </w:r>
+    </w:p>
+    <w:p>
+      <w:pPr>
+        <w:pStyle w:val="Heading1"/>
+        <w:spacing w:after="160"/>
+      </w:pPr>
+      <w:r>
+        <w:rPr>
+          <w:rFonts w:ascii="Aptos Display" w:hAnsi="Aptos Display"/>
+          <w:sz w:val="36"/>
+        </w:rPr>
+        <w:t>Launch Schedule Update</w:t>
+      </w:r>
+    </w:p>
+    <w:p>
+      <w:pPr>
+        <w:spacing w:after="160"/>
+      </w:pPr>
+      <w:r>
+        <w:t>Updated May 1, 2026. This schedule reflects the current implementation state after the public shell, beta preservation, staged paywall scaffolding, and disciplined speculation builder changes.</w:t>
+      </w:r>
+    </w:p>
+    <w:tbl>
+      <w:tblPr>
+        <w:tblStyle w:val="TableGrid"/>
+        <w:tblW w:type="auto" w:w="0"/>
+        <w:jc w:val="center"/>
+        <w:tblLook w:firstColumn="1" w:firstRow="1" w:lastColumn="0" w:lastRow="0" w:noHBand="0" w:noVBand="1" w:val="04A0"/>
+      </w:tblPr>
+      <w:tblGrid>
+        <w:gridCol w:w="2541"/>
+        <w:gridCol w:w="2541"/>
+        <w:gridCol w:w="2541"/>
+        <w:gridCol w:w="2541"/>
+      </w:tblGrid>
+      <w:tr>
+        <w:tc>
+          <w:tcPr>
+            <w:tcW w:type="dxa" w:w="2232"/>
+            <w:vAlign w:val="center"/>
+            <w:shd w:fill="17364A"/>
+            <w:tcBorders>
+              <w:top w:val="single" w:sz="8" w:space="0" w:color="D8E4EA"/>
+              <w:left w:val="single" w:sz="8" w:space="0" w:color="D8E4EA"/>
+              <w:bottom w:val="single" w:sz="8" w:space="0" w:color="D8E4EA"/>
+              <w:right w:val="single" w:sz="8" w:space="0" w:color="D8E4EA"/>
+              <w:insideH w:val="single" w:sz="8" w:space="0" w:color="D8E4EA"/>
+              <w:insideV w:val="single" w:sz="8" w:space="0" w:color="D8E4EA"/>
+            </w:tcBorders>
+          </w:tcPr>
+          <w:p>
+            <w:pPr>
+              <w:spacing w:after="0"/>
+              <w:jc w:val="center"/>
+            </w:pPr>
+            <w:r>
+              <w:rPr>
+                <w:rFonts w:ascii="Aptos" w:hAnsi="Aptos"/>
+                <w:b/>
+                <w:sz w:val="19"/>
+                <w:color w:val="FFFFFF"/>
+              </w:rPr>
+              <w:t>Phase</w:t>
+            </w:r>
+          </w:p>
+        </w:tc>
+        <w:tc>
+          <w:tcPr>
+            <w:tcW w:type="dxa" w:w="1440"/>
+            <w:vAlign w:val="center"/>
+            <w:shd w:fill="17364A"/>
+            <w:tcBorders>
+              <w:top w:val="single" w:sz="8" w:space="0" w:color="D8E4EA"/>
+              <w:left w:val="single" w:sz="8" w:space="0" w:color="D8E4EA"/>
+              <w:bottom w:val="single" w:sz="8" w:space="0" w:color="D8E4EA"/>
+              <w:right w:val="single" w:sz="8" w:space="0" w:color="D8E4EA"/>
+              <w:insideH w:val="single" w:sz="8" w:space="0" w:color="D8E4EA"/>
+              <w:insideV w:val="single" w:sz="8" w:space="0" w:color="D8E4EA"/>
+            </w:tcBorders>
+          </w:tcPr>
+          <w:p>
+            <w:pPr>
+              <w:spacing w:after="0"/>
+              <w:jc w:val="center"/>
+            </w:pPr>
+            <w:r>
+              <w:rPr>
+                <w:rFonts w:ascii="Aptos" w:hAnsi="Aptos"/>
+                <w:b/>
+                <w:sz w:val="19"/>
+                <w:color w:val="FFFFFF"/>
+              </w:rPr>
+              <w:t>Status</w:t>
+            </w:r>
+          </w:p>
+        </w:tc>
+        <w:tc>
+          <w:tcPr>
+            <w:tcW w:type="dxa" w:w="1800"/>
+            <w:vAlign w:val="center"/>
+            <w:shd w:fill="17364A"/>
+            <w:tcBorders>
+              <w:top w:val="single" w:sz="8" w:space="0" w:color="D8E4EA"/>
+              <w:left w:val="single" w:sz="8" w:space="0" w:color="D8E4EA"/>
+              <w:bottom w:val="single" w:sz="8" w:space="0" w:color="D8E4EA"/>
+              <w:right w:val="single" w:sz="8" w:space="0" w:color="D8E4EA"/>
+              <w:insideH w:val="single" w:sz="8" w:space="0" w:color="D8E4EA"/>
+              <w:insideV w:val="single" w:sz="8" w:space="0" w:color="D8E4EA"/>
+            </w:tcBorders>
+          </w:tcPr>
+          <w:p>
+            <w:pPr>
+              <w:spacing w:after="0"/>
+              <w:jc w:val="center"/>
+            </w:pPr>
+            <w:r>
+              <w:rPr>
+                <w:rFonts w:ascii="Aptos" w:hAnsi="Aptos"/>
+                <w:b/>
+                <w:sz w:val="19"/>
+                <w:color w:val="FFFFFF"/>
+              </w:rPr>
+              <w:t>Target window</w:t>
+            </w:r>
+          </w:p>
+        </w:tc>
+        <w:tc>
+          <w:tcPr>
+            <w:tcW w:type="dxa" w:w="4392"/>
+            <w:vAlign w:val="center"/>
+            <w:shd w:fill="17364A"/>
+            <w:tcBorders>
+              <w:top w:val="single" w:sz="8" w:space="0" w:color="D8E4EA"/>
+              <w:left w:val="single" w:sz="8" w:space="0" w:color="D8E4EA"/>
+              <w:bottom w:val="single" w:sz="8" w:space="0" w:color="D8E4EA"/>
+              <w:right w:val="single" w:sz="8" w:space="0" w:color="D8E4EA"/>
+              <w:insideH w:val="single" w:sz="8" w:space="0" w:color="D8E4EA"/>
+              <w:insideV w:val="single" w:sz="8" w:space="0" w:color="D8E4EA"/>
+            </w:tcBorders>
+          </w:tcPr>
+          <w:p>
+            <w:pPr>
+              <w:spacing w:after="0"/>
+              <w:jc w:val="center"/>
+            </w:pPr>
+            <w:r>
+              <w:rPr>
+                <w:rFonts w:ascii="Aptos" w:hAnsi="Aptos"/>
+                <w:b/>
+                <w:sz w:val="19"/>
+                <w:color w:val="FFFFFF"/>
+              </w:rPr>
+              <w:t>Next checkpoint / exit criteria</w:t>
+            </w:r>
+          </w:p>
+        </w:tc>
+      </w:tr>
+      <w:tr>
+        <w:tc>
+          <w:tcPr>
+            <w:tcW w:type="dxa" w:w="2232"/>
+            <w:vAlign w:val="center"/>
+            <w:shd w:fill="F7FAF8"/>
+            <w:tcBorders>
+              <w:top w:val="single" w:sz="8" w:space="0" w:color="D8E4EA"/>
+              <w:left w:val="single" w:sz="8" w:space="0" w:color="D8E4EA"/>
+              <w:bottom w:val="single" w:sz="8" w:space="0" w:color="D8E4EA"/>
+              <w:right w:val="single" w:sz="8" w:space="0" w:color="D8E4EA"/>
+              <w:insideH w:val="single" w:sz="8" w:space="0" w:color="D8E4EA"/>
+              <w:insideV w:val="single" w:sz="8" w:space="0" w:color="D8E4EA"/>
+            </w:tcBorders>
+          </w:tcPr>
+          <w:p>
+            <w:pPr>
+              <w:spacing w:after="0"/>
+            </w:pPr>
+            <w:r>
+              <w:rPr>
+                <w:rFonts w:ascii="Aptos" w:hAnsi="Aptos"/>
+                <w:sz w:val="18"/>
+              </w:rPr>
+              <w:t>Phase 0: Beta safety</w:t>
+            </w:r>
+          </w:p>
+        </w:tc>
+        <w:tc>
+          <w:tcPr>
+            <w:tcW w:type="dxa" w:w="1440"/>
+            <w:vAlign w:val="center"/>
+            <w:shd w:fill="F7FAF8"/>
+            <w:tcBorders>
+              <w:top w:val="single" w:sz="8" w:space="0" w:color="D8E4EA"/>
+              <w:left w:val="single" w:sz="8" w:space="0" w:color="D8E4EA"/>
+              <w:bottom w:val="single" w:sz="8" w:space="0" w:color="D8E4EA"/>
+              <w:right w:val="single" w:sz="8" w:space="0" w:color="D8E4EA"/>
+              <w:insideH w:val="single" w:sz="8" w:space="0" w:color="D8E4EA"/>
+              <w:insideV w:val="single" w:sz="8" w:space="0" w:color="D8E4EA"/>
+            </w:tcBorders>
+          </w:tcPr>
+          <w:p>
+            <w:pPr>
+              <w:spacing w:after="0"/>
+            </w:pPr>
+            <w:r>
+              <w:rPr>
+                <w:rFonts w:ascii="Aptos" w:hAnsi="Aptos"/>
+                <w:sz w:val="18"/>
+              </w:rPr>
+              <w:t>Complete</w:t>
+            </w:r>
+          </w:p>
+        </w:tc>
+        <w:tc>
+          <w:tcPr>
+            <w:tcW w:type="dxa" w:w="1800"/>
+            <w:vAlign w:val="center"/>
+            <w:shd w:fill="F7FAF8"/>
+            <w:tcBorders>
+              <w:top w:val="single" w:sz="8" w:space="0" w:color="D8E4EA"/>
+              <w:left w:val="single" w:sz="8" w:space="0" w:color="D8E4EA"/>
+              <w:bottom w:val="single" w:sz="8" w:space="0" w:color="D8E4EA"/>
+              <w:right w:val="single" w:sz="8" w:space="0" w:color="D8E4EA"/>
+              <w:insideH w:val="single" w:sz="8" w:space="0" w:color="D8E4EA"/>
+              <w:insideV w:val="single" w:sz="8" w:space="0" w:color="D8E4EA"/>
+            </w:tcBorders>
+          </w:tcPr>
+          <w:p>
+            <w:pPr>
+              <w:spacing w:after="0"/>
+            </w:pPr>
+            <w:r>
+              <w:rPr>
+                <w:rFonts w:ascii="Aptos" w:hAnsi="Aptos"/>
+                <w:sz w:val="18"/>
+              </w:rPr>
+              <w:t>May 1, 2026</w:t>
+            </w:r>
+          </w:p>
+        </w:tc>
+        <w:tc>
+          <w:tcPr>
+            <w:tcW w:type="dxa" w:w="4392"/>
+            <w:vAlign w:val="center"/>
+            <w:shd w:fill="F7FAF8"/>
+            <w:tcBorders>
+              <w:top w:val="single" w:sz="8" w:space="0" w:color="D8E4EA"/>
+              <w:left w:val="single" w:sz="8" w:space="0" w:color="D8E4EA"/>
+              <w:bottom w:val="single" w:sz="8" w:space="0" w:color="D8E4EA"/>
+              <w:right w:val="single" w:sz="8" w:space="0" w:color="D8E4EA"/>
+              <w:insideH w:val="single" w:sz="8" w:space="0" w:color="D8E4EA"/>
+              <w:insideV w:val="single" w:sz="8" w:space="0" w:color="D8E4EA"/>
+            </w:tcBorders>
+          </w:tcPr>
+          <w:p>
+            <w:pPr>
+              <w:spacing w:after="0"/>
+            </w:pPr>
+            <w:r>
+              <w:rPr>
+                <w:rFonts w:ascii="Aptos" w:hAnsi="Aptos"/>
+                <w:sz w:val="18"/>
+              </w:rPr>
+              <w:t>Beta entitlement, Admin/Beta scopes, and controlled fallback access are implemented.</w:t>
+            </w:r>
+          </w:p>
+        </w:tc>
+      </w:tr>
+      <w:tr>
+        <w:tc>
+          <w:tcPr>
+            <w:tcW w:type="dxa" w:w="2232"/>
+            <w:vAlign w:val="center"/>
+            <w:shd w:fill="FFFFFF"/>
+            <w:tcBorders>
+              <w:top w:val="single" w:sz="8" w:space="0" w:color="D8E4EA"/>
+              <w:left w:val="single" w:sz="8" w:space="0" w:color="D8E4EA"/>
+              <w:bottom w:val="single" w:sz="8" w:space="0" w:color="D8E4EA"/>
+              <w:right w:val="single" w:sz="8" w:space="0" w:color="D8E4EA"/>
+              <w:insideH w:val="single" w:sz="8" w:space="0" w:color="D8E4EA"/>
+              <w:insideV w:val="single" w:sz="8" w:space="0" w:color="D8E4EA"/>
+            </w:tcBorders>
+          </w:tcPr>
+          <w:p>
+            <w:pPr>
+              <w:spacing w:after="0"/>
+            </w:pPr>
+            <w:r>
+              <w:rPr>
+                <w:rFonts w:ascii="Aptos" w:hAnsi="Aptos"/>
+                <w:sz w:val="18"/>
+              </w:rPr>
+              <w:t>Phase 1: Public shell</w:t>
+            </w:r>
+          </w:p>
+        </w:tc>
+        <w:tc>
+          <w:tcPr>
+            <w:tcW w:type="dxa" w:w="1440"/>
+            <w:vAlign w:val="center"/>
+            <w:shd w:fill="FFFFFF"/>
+            <w:tcBorders>
+              <w:top w:val="single" w:sz="8" w:space="0" w:color="D8E4EA"/>
+              <w:left w:val="single" w:sz="8" w:space="0" w:color="D8E4EA"/>
+              <w:bottom w:val="single" w:sz="8" w:space="0" w:color="D8E4EA"/>
+              <w:right w:val="single" w:sz="8" w:space="0" w:color="D8E4EA"/>
+              <w:insideH w:val="single" w:sz="8" w:space="0" w:color="D8E4EA"/>
+              <w:insideV w:val="single" w:sz="8" w:space="0" w:color="D8E4EA"/>
+            </w:tcBorders>
+          </w:tcPr>
+          <w:p>
+            <w:pPr>
+              <w:spacing w:after="0"/>
+            </w:pPr>
+            <w:r>
+              <w:rPr>
+                <w:rFonts w:ascii="Aptos" w:hAnsi="Aptos"/>
+                <w:sz w:val="18"/>
+              </w:rPr>
+              <w:t>Complete</w:t>
+            </w:r>
+          </w:p>
+        </w:tc>
+        <w:tc>
+          <w:tcPr>
+            <w:tcW w:type="dxa" w:w="1800"/>
+            <w:vAlign w:val="center"/>
+            <w:shd w:fill="FFFFFF"/>
+            <w:tcBorders>
+              <w:top w:val="single" w:sz="8" w:space="0" w:color="D8E4EA"/>
+              <w:left w:val="single" w:sz="8" w:space="0" w:color="D8E4EA"/>
+              <w:bottom w:val="single" w:sz="8" w:space="0" w:color="D8E4EA"/>
+              <w:right w:val="single" w:sz="8" w:space="0" w:color="D8E4EA"/>
+              <w:insideH w:val="single" w:sz="8" w:space="0" w:color="D8E4EA"/>
+              <w:insideV w:val="single" w:sz="8" w:space="0" w:color="D8E4EA"/>
+            </w:tcBorders>
+          </w:tcPr>
+          <w:p>
+            <w:pPr>
+              <w:spacing w:after="0"/>
+            </w:pPr>
+            <w:r>
+              <w:rPr>
+                <w:rFonts w:ascii="Aptos" w:hAnsi="Aptos"/>
+                <w:sz w:val="18"/>
+              </w:rPr>
+              <w:t>May 1, 2026</w:t>
+            </w:r>
+          </w:p>
+        </w:tc>
+        <w:tc>
+          <w:tcPr>
+            <w:tcW w:type="dxa" w:w="4392"/>
+            <w:vAlign w:val="center"/>
+            <w:shd w:fill="FFFFFF"/>
+            <w:tcBorders>
+              <w:top w:val="single" w:sz="8" w:space="0" w:color="D8E4EA"/>
+              <w:left w:val="single" w:sz="8" w:space="0" w:color="D8E4EA"/>
+              <w:bottom w:val="single" w:sz="8" w:space="0" w:color="D8E4EA"/>
+              <w:right w:val="single" w:sz="8" w:space="0" w:color="D8E4EA"/>
+              <w:insideH w:val="single" w:sz="8" w:space="0" w:color="D8E4EA"/>
+              <w:insideV w:val="single" w:sz="8" w:space="0" w:color="D8E4EA"/>
+            </w:tcBorders>
+          </w:tcPr>
+          <w:p>
+            <w:pPr>
+              <w:spacing w:after="0"/>
+            </w:pPr>
+            <w:r>
+              <w:rPr>
+                <w:rFonts w:ascii="Aptos" w:hAnsi="Aptos"/>
+                <w:sz w:val="18"/>
+              </w:rPr>
+              <w:t>Homepage, pricing, login/register, and /app workspace split are implemented.</w:t>
+            </w:r>
+          </w:p>
+        </w:tc>
+      </w:tr>
+      <w:tr>
+        <w:tc>
+          <w:tcPr>
+            <w:tcW w:type="dxa" w:w="2232"/>
+            <w:vAlign w:val="center"/>
+            <w:shd w:fill="F7FAF8"/>
+            <w:tcBorders>
+              <w:top w:val="single" w:sz="8" w:space="0" w:color="D8E4EA"/>
+              <w:left w:val="single" w:sz="8" w:space="0" w:color="D8E4EA"/>
+              <w:bottom w:val="single" w:sz="8" w:space="0" w:color="D8E4EA"/>
+              <w:right w:val="single" w:sz="8" w:space="0" w:color="D8E4EA"/>
+              <w:insideH w:val="single" w:sz="8" w:space="0" w:color="D8E4EA"/>
+              <w:insideV w:val="single" w:sz="8" w:space="0" w:color="D8E4EA"/>
+            </w:tcBorders>
+          </w:tcPr>
+          <w:p>
+            <w:pPr>
+              <w:spacing w:after="0"/>
+            </w:pPr>
+            <w:r>
+              <w:rPr>
+                <w:rFonts w:ascii="Aptos" w:hAnsi="Aptos"/>
+                <w:sz w:val="18"/>
+              </w:rPr>
+              <w:t>Phase 2: Auth foundation</w:t>
+            </w:r>
+          </w:p>
+        </w:tc>
+        <w:tc>
+          <w:tcPr>
+            <w:tcW w:type="dxa" w:w="1440"/>
+            <w:vAlign w:val="center"/>
+            <w:shd w:fill="F7FAF8"/>
+            <w:tcBorders>
+              <w:top w:val="single" w:sz="8" w:space="0" w:color="D8E4EA"/>
+              <w:left w:val="single" w:sz="8" w:space="0" w:color="D8E4EA"/>
+              <w:bottom w:val="single" w:sz="8" w:space="0" w:color="D8E4EA"/>
+              <w:right w:val="single" w:sz="8" w:space="0" w:color="D8E4EA"/>
+              <w:insideH w:val="single" w:sz="8" w:space="0" w:color="D8E4EA"/>
+              <w:insideV w:val="single" w:sz="8" w:space="0" w:color="D8E4EA"/>
+            </w:tcBorders>
+          </w:tcPr>
+          <w:p>
+            <w:pPr>
+              <w:spacing w:after="0"/>
+            </w:pPr>
+            <w:r>
+              <w:rPr>
+                <w:rFonts w:ascii="Aptos" w:hAnsi="Aptos"/>
+                <w:sz w:val="18"/>
+              </w:rPr>
+              <w:t>In progress</w:t>
+            </w:r>
+          </w:p>
+        </w:tc>
+        <w:tc>
+          <w:tcPr>
+            <w:tcW w:type="dxa" w:w="1800"/>
+            <w:vAlign w:val="center"/>
+            <w:shd w:fill="F7FAF8"/>
+            <w:tcBorders>
+              <w:top w:val="single" w:sz="8" w:space="0" w:color="D8E4EA"/>
+              <w:left w:val="single" w:sz="8" w:space="0" w:color="D8E4EA"/>
+              <w:bottom w:val="single" w:sz="8" w:space="0" w:color="D8E4EA"/>
+              <w:right w:val="single" w:sz="8" w:space="0" w:color="D8E4EA"/>
+              <w:insideH w:val="single" w:sz="8" w:space="0" w:color="D8E4EA"/>
+              <w:insideV w:val="single" w:sz="8" w:space="0" w:color="D8E4EA"/>
+            </w:tcBorders>
+          </w:tcPr>
+          <w:p>
+            <w:pPr>
+              <w:spacing w:after="0"/>
+            </w:pPr>
+            <w:r>
+              <w:rPr>
+                <w:rFonts w:ascii="Aptos" w:hAnsi="Aptos"/>
+                <w:sz w:val="18"/>
+              </w:rPr>
+              <w:t>May 2-8, 2026</w:t>
+            </w:r>
+          </w:p>
+        </w:tc>
+        <w:tc>
+          <w:tcPr>
+            <w:tcW w:type="dxa" w:w="4392"/>
+            <w:vAlign w:val="center"/>
+            <w:shd w:fill="F7FAF8"/>
+            <w:tcBorders>
+              <w:top w:val="single" w:sz="8" w:space="0" w:color="D8E4EA"/>
+              <w:left w:val="single" w:sz="8" w:space="0" w:color="D8E4EA"/>
+              <w:bottom w:val="single" w:sz="8" w:space="0" w:color="D8E4EA"/>
+              <w:right w:val="single" w:sz="8" w:space="0" w:color="D8E4EA"/>
+              <w:insideH w:val="single" w:sz="8" w:space="0" w:color="D8E4EA"/>
+              <w:insideV w:val="single" w:sz="8" w:space="0" w:color="D8E4EA"/>
+            </w:tcBorders>
+          </w:tcPr>
+          <w:p>
+            <w:pPr>
+              <w:spacing w:after="0"/>
+            </w:pPr>
+            <w:r>
+              <w:rPr>
+                <w:rFonts w:ascii="Aptos" w:hAnsi="Aptos"/>
+                <w:sz w:val="18"/>
+              </w:rPr>
+              <w:t>Add durable sessions, expiry handling, logout, and account recovery.</w:t>
+            </w:r>
+          </w:p>
+        </w:tc>
+      </w:tr>
+      <w:tr>
+        <w:tc>
+          <w:tcPr>
+            <w:tcW w:type="dxa" w:w="2232"/>
+            <w:vAlign w:val="center"/>
+            <w:shd w:fill="FFFFFF"/>
+            <w:tcBorders>
+              <w:top w:val="single" w:sz="8" w:space="0" w:color="D8E4EA"/>
+              <w:left w:val="single" w:sz="8" w:space="0" w:color="D8E4EA"/>
+              <w:bottom w:val="single" w:sz="8" w:space="0" w:color="D8E4EA"/>
+              <w:right w:val="single" w:sz="8" w:space="0" w:color="D8E4EA"/>
+              <w:insideH w:val="single" w:sz="8" w:space="0" w:color="D8E4EA"/>
+              <w:insideV w:val="single" w:sz="8" w:space="0" w:color="D8E4EA"/>
+            </w:tcBorders>
+          </w:tcPr>
+          <w:p>
+            <w:pPr>
+              <w:spacing w:after="0"/>
+            </w:pPr>
+            <w:r>
+              <w:rPr>
+                <w:rFonts w:ascii="Aptos" w:hAnsi="Aptos"/>
+                <w:sz w:val="18"/>
+              </w:rPr>
+              <w:t>Phase 3: Scopes/paywall</w:t>
+            </w:r>
+          </w:p>
+        </w:tc>
+        <w:tc>
+          <w:tcPr>
+            <w:tcW w:type="dxa" w:w="1440"/>
+            <w:vAlign w:val="center"/>
+            <w:shd w:fill="FFFFFF"/>
+            <w:tcBorders>
+              <w:top w:val="single" w:sz="8" w:space="0" w:color="D8E4EA"/>
+              <w:left w:val="single" w:sz="8" w:space="0" w:color="D8E4EA"/>
+              <w:bottom w:val="single" w:sz="8" w:space="0" w:color="D8E4EA"/>
+              <w:right w:val="single" w:sz="8" w:space="0" w:color="D8E4EA"/>
+              <w:insideH w:val="single" w:sz="8" w:space="0" w:color="D8E4EA"/>
+              <w:insideV w:val="single" w:sz="8" w:space="0" w:color="D8E4EA"/>
+            </w:tcBorders>
+          </w:tcPr>
+          <w:p>
+            <w:pPr>
+              <w:spacing w:after="0"/>
+            </w:pPr>
+            <w:r>
+              <w:rPr>
+                <w:rFonts w:ascii="Aptos" w:hAnsi="Aptos"/>
+                <w:sz w:val="18"/>
+              </w:rPr>
+              <w:t>In progress</w:t>
+            </w:r>
+          </w:p>
+        </w:tc>
+        <w:tc>
+          <w:tcPr>
+            <w:tcW w:type="dxa" w:w="1800"/>
+            <w:vAlign w:val="center"/>
+            <w:shd w:fill="FFFFFF"/>
+            <w:tcBorders>
+              <w:top w:val="single" w:sz="8" w:space="0" w:color="D8E4EA"/>
+              <w:left w:val="single" w:sz="8" w:space="0" w:color="D8E4EA"/>
+              <w:bottom w:val="single" w:sz="8" w:space="0" w:color="D8E4EA"/>
+              <w:right w:val="single" w:sz="8" w:space="0" w:color="D8E4EA"/>
+              <w:insideH w:val="single" w:sz="8" w:space="0" w:color="D8E4EA"/>
+              <w:insideV w:val="single" w:sz="8" w:space="0" w:color="D8E4EA"/>
+            </w:tcBorders>
+          </w:tcPr>
+          <w:p>
+            <w:pPr>
+              <w:spacing w:after="0"/>
+            </w:pPr>
+            <w:r>
+              <w:rPr>
+                <w:rFonts w:ascii="Aptos" w:hAnsi="Aptos"/>
+                <w:sz w:val="18"/>
+              </w:rPr>
+              <w:t>May 4-12, 2026</w:t>
+            </w:r>
+          </w:p>
+        </w:tc>
+        <w:tc>
+          <w:tcPr>
+            <w:tcW w:type="dxa" w:w="4392"/>
+            <w:vAlign w:val="center"/>
+            <w:shd w:fill="FFFFFF"/>
+            <w:tcBorders>
+              <w:top w:val="single" w:sz="8" w:space="0" w:color="D8E4EA"/>
+              <w:left w:val="single" w:sz="8" w:space="0" w:color="D8E4EA"/>
+              <w:bottom w:val="single" w:sz="8" w:space="0" w:color="D8E4EA"/>
+              <w:right w:val="single" w:sz="8" w:space="0" w:color="D8E4EA"/>
+              <w:insideH w:val="single" w:sz="8" w:space="0" w:color="D8E4EA"/>
+              <w:insideV w:val="single" w:sz="8" w:space="0" w:color="D8E4EA"/>
+            </w:tcBorders>
+          </w:tcPr>
+          <w:p>
+            <w:pPr>
+              <w:spacing w:after="0"/>
+            </w:pPr>
+            <w:r>
+              <w:rPr>
+                <w:rFonts w:ascii="Aptos" w:hAnsi="Aptos"/>
+                <w:sz w:val="18"/>
+              </w:rPr>
+              <w:t>Apply shared server-side scope middleware and add quota meters.</w:t>
+            </w:r>
+          </w:p>
+        </w:tc>
+      </w:tr>
+      <w:tr>
+        <w:tc>
+          <w:tcPr>
+            <w:tcW w:type="dxa" w:w="2232"/>
+            <w:vAlign w:val="center"/>
+            <w:shd w:fill="F7FAF8"/>
+            <w:tcBorders>
+              <w:top w:val="single" w:sz="8" w:space="0" w:color="D8E4EA"/>
+              <w:left w:val="single" w:sz="8" w:space="0" w:color="D8E4EA"/>
+              <w:bottom w:val="single" w:sz="8" w:space="0" w:color="D8E4EA"/>
+              <w:right w:val="single" w:sz="8" w:space="0" w:color="D8E4EA"/>
+              <w:insideH w:val="single" w:sz="8" w:space="0" w:color="D8E4EA"/>
+              <w:insideV w:val="single" w:sz="8" w:space="0" w:color="D8E4EA"/>
+            </w:tcBorders>
+          </w:tcPr>
+          <w:p>
+            <w:pPr>
+              <w:spacing w:after="0"/>
+            </w:pPr>
+            <w:r>
+              <w:rPr>
+                <w:rFonts w:ascii="Aptos" w:hAnsi="Aptos"/>
+                <w:sz w:val="18"/>
+              </w:rPr>
+              <w:t>Phase 4: Billing</w:t>
+            </w:r>
+          </w:p>
+        </w:tc>
+        <w:tc>
+          <w:tcPr>
+            <w:tcW w:type="dxa" w:w="1440"/>
+            <w:vAlign w:val="center"/>
+            <w:shd w:fill="F7FAF8"/>
+            <w:tcBorders>
+              <w:top w:val="single" w:sz="8" w:space="0" w:color="D8E4EA"/>
+              <w:left w:val="single" w:sz="8" w:space="0" w:color="D8E4EA"/>
+              <w:bottom w:val="single" w:sz="8" w:space="0" w:color="D8E4EA"/>
+              <w:right w:val="single" w:sz="8" w:space="0" w:color="D8E4EA"/>
+              <w:insideH w:val="single" w:sz="8" w:space="0" w:color="D8E4EA"/>
+              <w:insideV w:val="single" w:sz="8" w:space="0" w:color="D8E4EA"/>
+            </w:tcBorders>
+          </w:tcPr>
+          <w:p>
+            <w:pPr>
+              <w:spacing w:after="0"/>
+            </w:pPr>
+            <w:r>
+              <w:rPr>
+                <w:rFonts w:ascii="Aptos" w:hAnsi="Aptos"/>
+                <w:sz w:val="18"/>
+              </w:rPr>
+              <w:t>Scheduled</w:t>
+            </w:r>
+          </w:p>
+        </w:tc>
+        <w:tc>
+          <w:tcPr>
+            <w:tcW w:type="dxa" w:w="1800"/>
+            <w:vAlign w:val="center"/>
+            <w:shd w:fill="F7FAF8"/>
+            <w:tcBorders>
+              <w:top w:val="single" w:sz="8" w:space="0" w:color="D8E4EA"/>
+              <w:left w:val="single" w:sz="8" w:space="0" w:color="D8E4EA"/>
+              <w:bottom w:val="single" w:sz="8" w:space="0" w:color="D8E4EA"/>
+              <w:right w:val="single" w:sz="8" w:space="0" w:color="D8E4EA"/>
+              <w:insideH w:val="single" w:sz="8" w:space="0" w:color="D8E4EA"/>
+              <w:insideV w:val="single" w:sz="8" w:space="0" w:color="D8E4EA"/>
+            </w:tcBorders>
+          </w:tcPr>
+          <w:p>
+            <w:pPr>
+              <w:spacing w:after="0"/>
+            </w:pPr>
+            <w:r>
+              <w:rPr>
+                <w:rFonts w:ascii="Aptos" w:hAnsi="Aptos"/>
+                <w:sz w:val="18"/>
+              </w:rPr>
+              <w:t>May 8-15, 2026</w:t>
+            </w:r>
+          </w:p>
+        </w:tc>
+        <w:tc>
+          <w:tcPr>
+            <w:tcW w:type="dxa" w:w="4392"/>
+            <w:vAlign w:val="center"/>
+            <w:shd w:fill="F7FAF8"/>
+            <w:tcBorders>
+              <w:top w:val="single" w:sz="8" w:space="0" w:color="D8E4EA"/>
+              <w:left w:val="single" w:sz="8" w:space="0" w:color="D8E4EA"/>
+              <w:bottom w:val="single" w:sz="8" w:space="0" w:color="D8E4EA"/>
+              <w:right w:val="single" w:sz="8" w:space="0" w:color="D8E4EA"/>
+              <w:insideH w:val="single" w:sz="8" w:space="0" w:color="D8E4EA"/>
+              <w:insideV w:val="single" w:sz="8" w:space="0" w:color="D8E4EA"/>
+            </w:tcBorders>
+          </w:tcPr>
+          <w:p>
+            <w:pPr>
+              <w:spacing w:after="0"/>
+            </w:pPr>
+            <w:r>
+              <w:rPr>
+                <w:rFonts w:ascii="Aptos" w:hAnsi="Aptos"/>
+                <w:sz w:val="18"/>
+              </w:rPr>
+              <w:t>Sync Stripe webhooks, customer portal, and subscription status changes.</w:t>
+            </w:r>
+          </w:p>
+        </w:tc>
+      </w:tr>
+      <w:tr>
+        <w:tc>
+          <w:tcPr>
+            <w:tcW w:type="dxa" w:w="2232"/>
+            <w:vAlign w:val="center"/>
+            <w:shd w:fill="FFFFFF"/>
+            <w:tcBorders>
+              <w:top w:val="single" w:sz="8" w:space="0" w:color="D8E4EA"/>
+              <w:left w:val="single" w:sz="8" w:space="0" w:color="D8E4EA"/>
+              <w:bottom w:val="single" w:sz="8" w:space="0" w:color="D8E4EA"/>
+              <w:right w:val="single" w:sz="8" w:space="0" w:color="D8E4EA"/>
+              <w:insideH w:val="single" w:sz="8" w:space="0" w:color="D8E4EA"/>
+              <w:insideV w:val="single" w:sz="8" w:space="0" w:color="D8E4EA"/>
+            </w:tcBorders>
+          </w:tcPr>
+          <w:p>
+            <w:pPr>
+              <w:spacing w:after="0"/>
+            </w:pPr>
+            <w:r>
+              <w:rPr>
+                <w:rFonts w:ascii="Aptos" w:hAnsi="Aptos"/>
+                <w:sz w:val="18"/>
+              </w:rPr>
+              <w:t>Phase 5: Enterprise</w:t>
+            </w:r>
+          </w:p>
+        </w:tc>
+        <w:tc>
+          <w:tcPr>
+            <w:tcW w:type="dxa" w:w="1440"/>
+            <w:vAlign w:val="center"/>
+            <w:shd w:fill="FFFFFF"/>
+            <w:tcBorders>
+              <w:top w:val="single" w:sz="8" w:space="0" w:color="D8E4EA"/>
+              <w:left w:val="single" w:sz="8" w:space="0" w:color="D8E4EA"/>
+              <w:bottom w:val="single" w:sz="8" w:space="0" w:color="D8E4EA"/>
+              <w:right w:val="single" w:sz="8" w:space="0" w:color="D8E4EA"/>
+              <w:insideH w:val="single" w:sz="8" w:space="0" w:color="D8E4EA"/>
+              <w:insideV w:val="single" w:sz="8" w:space="0" w:color="D8E4EA"/>
+            </w:tcBorders>
+          </w:tcPr>
+          <w:p>
+            <w:pPr>
+              <w:spacing w:after="0"/>
+            </w:pPr>
+            <w:r>
+              <w:rPr>
+                <w:rFonts w:ascii="Aptos" w:hAnsi="Aptos"/>
+                <w:sz w:val="18"/>
+              </w:rPr>
+              <w:t>Scheduled</w:t>
+            </w:r>
+          </w:p>
+        </w:tc>
+        <w:tc>
+          <w:tcPr>
+            <w:tcW w:type="dxa" w:w="1800"/>
+            <w:vAlign w:val="center"/>
+            <w:shd w:fill="FFFFFF"/>
+            <w:tcBorders>
+              <w:top w:val="single" w:sz="8" w:space="0" w:color="D8E4EA"/>
+              <w:left w:val="single" w:sz="8" w:space="0" w:color="D8E4EA"/>
+              <w:bottom w:val="single" w:sz="8" w:space="0" w:color="D8E4EA"/>
+              <w:right w:val="single" w:sz="8" w:space="0" w:color="D8E4EA"/>
+              <w:insideH w:val="single" w:sz="8" w:space="0" w:color="D8E4EA"/>
+              <w:insideV w:val="single" w:sz="8" w:space="0" w:color="D8E4EA"/>
+            </w:tcBorders>
+          </w:tcPr>
+          <w:p>
+            <w:pPr>
+              <w:spacing w:after="0"/>
+            </w:pPr>
+            <w:r>
+              <w:rPr>
+                <w:rFonts w:ascii="Aptos" w:hAnsi="Aptos"/>
+                <w:sz w:val="18"/>
+              </w:rPr>
+              <w:t>May 15-22, 2026</w:t>
+            </w:r>
+          </w:p>
+        </w:tc>
+        <w:tc>
+          <w:tcPr>
+            <w:tcW w:type="dxa" w:w="4392"/>
+            <w:vAlign w:val="center"/>
+            <w:shd w:fill="FFFFFF"/>
+            <w:tcBorders>
+              <w:top w:val="single" w:sz="8" w:space="0" w:color="D8E4EA"/>
+              <w:left w:val="single" w:sz="8" w:space="0" w:color="D8E4EA"/>
+              <w:bottom w:val="single" w:sz="8" w:space="0" w:color="D8E4EA"/>
+              <w:right w:val="single" w:sz="8" w:space="0" w:color="D8E4EA"/>
+              <w:insideH w:val="single" w:sz="8" w:space="0" w:color="D8E4EA"/>
+              <w:insideV w:val="single" w:sz="8" w:space="0" w:color="D8E4EA"/>
+            </w:tcBorders>
+          </w:tcPr>
+          <w:p>
+            <w:pPr>
+              <w:spacing w:after="0"/>
+            </w:pPr>
+            <w:r>
+              <w:rPr>
+                <w:rFonts w:ascii="Aptos" w:hAnsi="Aptos"/>
+                <w:sz w:val="18"/>
+              </w:rPr>
+              <w:t>Add organizations, members, manual licenses, and enterprise admin tools.</w:t>
+            </w:r>
+          </w:p>
+        </w:tc>
+      </w:tr>
+      <w:tr>
+        <w:tc>
+          <w:tcPr>
+            <w:tcW w:type="dxa" w:w="2232"/>
+            <w:vAlign w:val="center"/>
+            <w:shd w:fill="F7FAF8"/>
+            <w:tcBorders>
+              <w:top w:val="single" w:sz="8" w:space="0" w:color="D8E4EA"/>
+              <w:left w:val="single" w:sz="8" w:space="0" w:color="D8E4EA"/>
+              <w:bottom w:val="single" w:sz="8" w:space="0" w:color="D8E4EA"/>
+              <w:right w:val="single" w:sz="8" w:space="0" w:color="D8E4EA"/>
+              <w:insideH w:val="single" w:sz="8" w:space="0" w:color="D8E4EA"/>
+              <w:insideV w:val="single" w:sz="8" w:space="0" w:color="D8E4EA"/>
+            </w:tcBorders>
+          </w:tcPr>
+          <w:p>
+            <w:pPr>
+              <w:spacing w:after="0"/>
+            </w:pPr>
+            <w:r>
+              <w:rPr>
+                <w:rFonts w:ascii="Aptos" w:hAnsi="Aptos"/>
+                <w:sz w:val="18"/>
+              </w:rPr>
+              <w:t>Phase 6: Launch hardening</w:t>
+            </w:r>
+          </w:p>
+        </w:tc>
+        <w:tc>
+          <w:tcPr>
+            <w:tcW w:type="dxa" w:w="1440"/>
+            <w:vAlign w:val="center"/>
+            <w:shd w:fill="F7FAF8"/>
+            <w:tcBorders>
+              <w:top w:val="single" w:sz="8" w:space="0" w:color="D8E4EA"/>
+              <w:left w:val="single" w:sz="8" w:space="0" w:color="D8E4EA"/>
+              <w:bottom w:val="single" w:sz="8" w:space="0" w:color="D8E4EA"/>
+              <w:right w:val="single" w:sz="8" w:space="0" w:color="D8E4EA"/>
+              <w:insideH w:val="single" w:sz="8" w:space="0" w:color="D8E4EA"/>
+              <w:insideV w:val="single" w:sz="8" w:space="0" w:color="D8E4EA"/>
+            </w:tcBorders>
+          </w:tcPr>
+          <w:p>
+            <w:pPr>
+              <w:spacing w:after="0"/>
+            </w:pPr>
+            <w:r>
+              <w:rPr>
+                <w:rFonts w:ascii="Aptos" w:hAnsi="Aptos"/>
+                <w:sz w:val="18"/>
+              </w:rPr>
+              <w:t>Scheduled</w:t>
+            </w:r>
+          </w:p>
+        </w:tc>
+        <w:tc>
+          <w:tcPr>
+            <w:tcW w:type="dxa" w:w="1800"/>
+            <w:vAlign w:val="center"/>
+            <w:shd w:fill="F7FAF8"/>
+            <w:tcBorders>
+              <w:top w:val="single" w:sz="8" w:space="0" w:color="D8E4EA"/>
+              <w:left w:val="single" w:sz="8" w:space="0" w:color="D8E4EA"/>
+              <w:bottom w:val="single" w:sz="8" w:space="0" w:color="D8E4EA"/>
+              <w:right w:val="single" w:sz="8" w:space="0" w:color="D8E4EA"/>
+              <w:insideH w:val="single" w:sz="8" w:space="0" w:color="D8E4EA"/>
+              <w:insideV w:val="single" w:sz="8" w:space="0" w:color="D8E4EA"/>
+            </w:tcBorders>
+          </w:tcPr>
+          <w:p>
+            <w:pPr>
+              <w:spacing w:after="0"/>
+            </w:pPr>
+            <w:r>
+              <w:rPr>
+                <w:rFonts w:ascii="Aptos" w:hAnsi="Aptos"/>
+                <w:sz w:val="18"/>
+              </w:rPr>
+              <w:t>May 22-29, 2026</w:t>
+            </w:r>
+          </w:p>
+        </w:tc>
+        <w:tc>
+          <w:tcPr>
+            <w:tcW w:type="dxa" w:w="4392"/>
+            <w:vAlign w:val="center"/>
+            <w:shd w:fill="F7FAF8"/>
+            <w:tcBorders>
+              <w:top w:val="single" w:sz="8" w:space="0" w:color="D8E4EA"/>
+              <w:left w:val="single" w:sz="8" w:space="0" w:color="D8E4EA"/>
+              <w:bottom w:val="single" w:sz="8" w:space="0" w:color="D8E4EA"/>
+              <w:right w:val="single" w:sz="8" w:space="0" w:color="D8E4EA"/>
+              <w:insideH w:val="single" w:sz="8" w:space="0" w:color="D8E4EA"/>
+              <w:insideV w:val="single" w:sz="8" w:space="0" w:color="D8E4EA"/>
+            </w:tcBorders>
+          </w:tcPr>
+          <w:p>
+            <w:pPr>
+              <w:spacing w:after="0"/>
+            </w:pPr>
+            <w:r>
+              <w:rPr>
+                <w:rFonts w:ascii="Aptos" w:hAnsi="Aptos"/>
+                <w:sz w:val="18"/>
+              </w:rPr>
+              <w:t>Complete tests, audit logs, backup checks, rollback, and launch checklist.</w:t>
+            </w:r>
+          </w:p>
+        </w:tc>
+      </w:tr>
+    </w:tbl>
+    <w:p>
+      <w:pPr>
+        <w:spacing w:before="160"/>
+      </w:pPr>
+      <w:r>
+        <w:rPr>
+          <w:b/>
+        </w:rPr>
+        <w:t xml:space="preserve">Current schedule focus: </w:t>
+      </w:r>
+      <w:r>
+        <w:t>finish Phase 2 server-owned sessions and Phase 3 shared scope enforcement before completing Stripe billing automation.</w:t>
+      </w:r>
+    </w:p>
     <w:sectPr>
       <w:footerReference w:type="default" r:id="rId9"/>
       <w:pgSz w:w="12240" w:h="15840"/>

</xml_diff>